<commit_message>
TODOS LOS MODULOS INTEGRADOS HASTA LA FECHA
</commit_message>
<xml_diff>
--- a/api/PLANTILLA_PEDIDOS/PEDIDO_PLANTILLA_PYTHON3.docx
+++ b/api/PLANTILLA_PEDIDOS/PEDIDO_PLANTILLA_PYTHON3.docx
@@ -486,6 +486,17 @@
                   <w:r>
                     <w:t xml:space="preserve"> }}</w:t>
                   </w:r>
+                  <w:r>
+                    <w:t>-{{</w:t>
+                  </w:r>
+                  <w:r>
+                    <w:t>hora</w:t>
+                  </w:r>
+                  <w:bookmarkStart w:id="0" w:name="_GoBack"/>
+                  <w:bookmarkEnd w:id="0"/>
+                  <w:r>
+                    <w:t>}}</w:t>
+                  </w:r>
                 </w:p>
               </w:tc>
               <w:tc>
@@ -1090,8 +1101,6 @@
                       <w:lang w:val="es-ES"/>
                     </w:rPr>
                   </w:pPr>
-                  <w:bookmarkStart w:id="0" w:name="_GoBack"/>
-                  <w:bookmarkEnd w:id="0"/>
                   <w:r>
                     <w:rPr>
                       <w:lang w:val="es-ES"/>
@@ -4778,7 +4787,7 @@
 </file>
 
 <file path=customXml/itemProps2.xml><?xml version="1.0" encoding="utf-8"?>
-<ds:datastoreItem xmlns:ds="http://schemas.openxmlformats.org/officeDocument/2006/customXml" ds:itemID="{63159ED7-19D1-4F21-BA3D-87940C4A5D07}">
+<ds:datastoreItem xmlns:ds="http://schemas.openxmlformats.org/officeDocument/2006/customXml" ds:itemID="{178A5077-8678-448F-A850-67A5D218A462}">
   <ds:schemaRefs>
     <ds:schemaRef ds:uri="http://schemas.openxmlformats.org/officeDocument/2006/bibliography"/>
   </ds:schemaRefs>

</xml_diff>